<commit_message>
Law firm profile: match the website's counter block
Follow-up to the head office row: the client asked for the whole counter block
to match the website, so take its rules from the live page instead of our own
divider design.

Measured on www.legaloneglobal.com at 375px (.lawfirm-info):
- cells are 45% wide inline-blocks, 3px apart, 30px between rows;
- headings are the site's link blue #0084BA, 19.008px, bold, 5px above the
  value;
- values are 14.784px bold #2D2D2D;
- the left cell of each row carries a 1px #99CEE3 rule on its right edge, and
  the two cells of the first row carry a 66%-wide rule underneath (the second
  row has none).

Our headings were near-black 17px and the values 14px; the rules now sit on the
first row only, matching the site, and the last row no longer adds a margin
before the Merits card. Verified by rendering the block with these exact values
and comparing it with the live page at the same width.
</commit_message>
<xml_diff>
--- a/deliverables/LegalOne小程序第三轮页面修复变更说明.docx
+++ b/deliverables/LegalOne小程序第三轮页面修复变更说明.docx
@@ -984,7 +984,7 @@
                 <w:color w:val="303030"/>
                 <w:sz w:val="18"/>
               </w:rPr>
-              <w:t>按官网 displayHeadOffice 的逻辑补上 Head office 一行（城市 / 国家，链接到该办公室），无标记的律所不显示该行；计数区块改为官网的两行四格</w:t>
+              <w:t>按官网 displayHeadOffice 的逻辑补上 Head office 一行（城市 / 国家，链接到该办公室），无标记的律所不显示该行；计数区块的排布与配色（蓝标题、加粗数值、竖线与首行分隔线）一并对齐官网</w:t>
             </w:r>
           </w:p>
         </w:tc>
@@ -2594,7 +2594,7 @@
           <w:color w:val="303030"/>
           <w:sz w:val="20"/>
         </w:rPr>
-        <w:t>计数区块的竖线与下划线改为两行一致（此前只有第一行有），四格排布与官网一致。</w:t>
+        <w:t>计数区块的版式一并对齐官网 .lawfirm-info：格子宽 45%、列间距 3px、行间距 30px；标题为官网链接蓝 #0084BA、字号 19.008px、加粗、下方 5px；数值 14.784px 加粗 #2D2D2D；竖线位于每行左侧格（四格布局下为第 1、3 格），第一行两格下方保留官网那条 66% 宽的分隔线，第二行与官网一样不画线。</w:t>
       </w:r>
     </w:p>
     <w:p>
@@ -4954,7 +4954,7 @@
           <w:color w:val="303030"/>
           <w:sz w:val="20"/>
         </w:rPr>
-        <w:t>律所档案：抽查 Grandway Law Offices，确认计数区块第一格为 Head office（Beijing, China）并可进入该办公室档案页；再抽查一家没有 headOffice 标记的律所，确认该行不出现。</w:t>
+        <w:t>律所档案：抽查 Grandway Law Offices，确认 Head office（Beijing, China）为计数区第一格、标题为官网链接蓝、竖线与首行分隔线位置正确，并可进入该办公室档案页；再抽查一家没有 headOffice 标记的律所，确认该行不出现。</w:t>
       </w:r>
     </w:p>
     <w:p>

</xml_diff>

<commit_message>
Article body: drop markup the converter does not know
The Sullivan & Cromwell article printed its own HTML source: div
class="OutlineElement Ltr SCXW…" and style="-webkit-user-drag: none; …" came
through as body text.

The body is pasted from Word, so each paragraph sits inside <div
class="OutlineElement…"> and <p class="Paragraph…"> wrappers. The body
converter only knew a handful of tags, and text between the tags it did
recognise was copied verbatim — including those wrapper tags. parseRuns then
consumed everything after the "<", which is why the reader saw
`div class="OutlineElement …`.

Both paths are fixed: the run parser now drops any tag it does not handle
(keeping paragraphs, lists, pictures and the inline bold/italic/link runs), so
wrappers and their attributes can never reach the page. A sweep of 400 live
article bodies now finds no leaked tag or style text at all; the reported
article renders six clean paragraphs and its page data is 10 KB.
</commit_message>
<xml_diff>
--- a/deliverables/LegalOne小程序第三轮页面修复变更说明.docx
+++ b/deliverables/LegalOne小程序第三轮页面修复变更说明.docx
@@ -1544,6 +1544,116 @@
                 <w:sz w:val="18"/>
               </w:rPr>
               <w:t>获奖人卡片在 awardContent 与文章正文两种存放位置改为复用同一套解析与卡片模板；卡片字段分行显示；旧模板的 ../../ 相对路径归一化，Click for profile 可正确跳转</w:t>
+            </w:r>
+          </w:p>
+        </w:tc>
+      </w:tr>
+      <w:tr>
+        <w:trPr>
+          <w:cantSplit/>
+        </w:trPr>
+        <w:tc>
+          <w:tcPr>
+            <w:tcW w:type="dxa" w:w="624"/>
+            <w:vAlign w:val="center"/>
+            <w:tcBorders>
+              <w:top w:val="single" w:sz="6" w:color="D9D9D9"/>
+              <w:left w:val="single" w:sz="6" w:color="D9D9D9"/>
+              <w:bottom w:val="single" w:sz="6" w:color="D9D9D9"/>
+              <w:right w:val="single" w:sz="6" w:color="D9D9D9"/>
+              <w:insideH w:val="single" w:sz="6" w:color="D9D9D9"/>
+              <w:insideV w:val="single" w:sz="6" w:color="D9D9D9"/>
+            </w:tcBorders>
+            <w:tcMar>
+              <w:top w:w="100" w:type="dxa"/>
+              <w:start w:w="120" w:type="dxa"/>
+              <w:bottom w:w="100" w:type="dxa"/>
+              <w:end w:w="120" w:type="dxa"/>
+            </w:tcMar>
+          </w:tcPr>
+          <w:p>
+            <w:pPr>
+              <w:spacing w:after="0" w:line="288" w:lineRule="auto"/>
+              <w:jc w:val="center"/>
+            </w:pPr>
+            <w:r>
+              <w:rPr>
+                <w:rFonts w:ascii="Aptos" w:hAnsi="Aptos" w:eastAsia="Microsoft YaHei"/>
+                <w:b w:val="0"/>
+                <w:color w:val="303030"/>
+                <w:sz w:val="18"/>
+              </w:rPr>
+              <w:t>12</w:t>
+            </w:r>
+          </w:p>
+        </w:tc>
+        <w:tc>
+          <w:tcPr>
+            <w:tcW w:type="dxa" w:w="3005"/>
+            <w:vAlign w:val="center"/>
+            <w:tcBorders>
+              <w:top w:val="single" w:sz="6" w:color="D9D9D9"/>
+              <w:left w:val="single" w:sz="6" w:color="D9D9D9"/>
+              <w:bottom w:val="single" w:sz="6" w:color="D9D9D9"/>
+              <w:right w:val="single" w:sz="6" w:color="D9D9D9"/>
+              <w:insideH w:val="single" w:sz="6" w:color="D9D9D9"/>
+              <w:insideV w:val="single" w:sz="6" w:color="D9D9D9"/>
+            </w:tcBorders>
+            <w:tcMar>
+              <w:top w:w="100" w:type="dxa"/>
+              <w:start w:w="120" w:type="dxa"/>
+              <w:bottom w:w="100" w:type="dxa"/>
+              <w:end w:w="120" w:type="dxa"/>
+            </w:tcMar>
+          </w:tcPr>
+          <w:p>
+            <w:pPr>
+              <w:spacing w:after="0" w:line="288" w:lineRule="auto"/>
+              <w:jc w:val="left"/>
+            </w:pPr>
+            <w:r>
+              <w:rPr>
+                <w:rFonts w:ascii="Aptos" w:hAnsi="Aptos" w:eastAsia="Microsoft YaHei"/>
+                <w:b w:val="0"/>
+                <w:color w:val="303030"/>
+                <w:sz w:val="18"/>
+              </w:rPr>
+              <w:t>文章正文显示成 HTML 源码</w:t>
+            </w:r>
+          </w:p>
+        </w:tc>
+        <w:tc>
+          <w:tcPr>
+            <w:tcW w:type="dxa" w:w="5102"/>
+            <w:vAlign w:val="center"/>
+            <w:tcBorders>
+              <w:top w:val="single" w:sz="6" w:color="D9D9D9"/>
+              <w:left w:val="single" w:sz="6" w:color="D9D9D9"/>
+              <w:bottom w:val="single" w:sz="6" w:color="D9D9D9"/>
+              <w:right w:val="single" w:sz="6" w:color="D9D9D9"/>
+              <w:insideH w:val="single" w:sz="6" w:color="D9D9D9"/>
+              <w:insideV w:val="single" w:sz="6" w:color="D9D9D9"/>
+            </w:tcBorders>
+            <w:tcMar>
+              <w:top w:w="100" w:type="dxa"/>
+              <w:start w:w="120" w:type="dxa"/>
+              <w:bottom w:w="100" w:type="dxa"/>
+              <w:end w:w="120" w:type="dxa"/>
+            </w:tcMar>
+          </w:tcPr>
+          <w:p>
+            <w:pPr>
+              <w:spacing w:after="0" w:line="288" w:lineRule="auto"/>
+              <w:jc w:val="left"/>
+            </w:pPr>
+            <w:r>
+              <w:rPr>
+                <w:rFonts w:ascii="Aptos" w:hAnsi="Aptos" w:eastAsia="Microsoft YaHei"/>
+                <w:b w:val="0"/>
+                <w:color w:val="303030"/>
+                <w:sz w:val="18"/>
+              </w:rPr>
+              <w:t>正文解析器改为忽略所有不认识的包装标签（Word 粘贴的 div / p 包装不再泄漏为文字）；抽查 400 篇正文无泄漏</w:t>
             </w:r>
           </w:p>
         </w:tc>
@@ -3612,6 +3722,68 @@
     </w:p>
     <w:p>
       <w:pPr>
+        <w:pStyle w:val="Heading2"/>
+        <w:keepNext/>
+        <w:spacing w:before="180" w:after="100" w:line="264" w:lineRule="auto"/>
+      </w:pPr>
+      <w:r>
+        <w:rPr>
+          <w:rFonts w:ascii="Aptos" w:hAnsi="Aptos" w:eastAsia="Microsoft YaHei"/>
+          <w:b/>
+          <w:color w:val="000000"/>
+          <w:sz w:val="24"/>
+        </w:rPr>
+        <w:t>12. 文章正文显示成 HTML 源码</w:t>
+      </w:r>
+    </w:p>
+    <w:p>
+      <w:pPr>
+        <w:spacing w:after="120" w:line="324" w:lineRule="auto"/>
+      </w:pPr>
+      <w:r>
+        <w:rPr>
+          <w:rFonts w:ascii="Aptos" w:hAnsi="Aptos" w:eastAsia="Microsoft YaHei"/>
+          <w:b w:val="0"/>
+          <w:color w:val="303030"/>
+          <w:sz w:val="21"/>
+        </w:rPr>
+        <w:t>客户反馈：Sullivan &amp; Cromwell 一文正文里直接显示出了 HTML 源码（div class="OutlineElement …" 以及 style="-webkit-user-drag…" 之类）。原因是这篇正文是从 Word 粘贴的，段落外面套着多层 &lt;div class="OutlineElement"&gt;、&lt;p class="Paragraph"&gt; 这类包装标签；正文解析器只认识段落/列表/图片等少数标签，遇到不认识的包装标签时把标签内容当成了普通文字，于是属性内容被当成正文显示了出来。</w:t>
+      </w:r>
+    </w:p>
+    <w:p>
+      <w:pPr>
+        <w:pStyle w:val="ListBullet"/>
+        <w:spacing w:after="60" w:line="300" w:lineRule="auto"/>
+        <w:ind w:left="369" w:hanging="142"/>
+      </w:pPr>
+      <w:r>
+        <w:rPr>
+          <w:rFonts w:ascii="Aptos" w:hAnsi="Aptos" w:eastAsia="Microsoft YaHei"/>
+          <w:b w:val="0"/>
+          <w:color w:val="303030"/>
+          <w:sz w:val="20"/>
+        </w:rPr>
+        <w:t>正文解析器改为忽略所有不认识的标签：只保留段落、列表、图片以及粗体/斜体/链接等行内语义，其余包装标签（div、section、o:p 等）连同属性一起丢弃。</w:t>
+      </w:r>
+    </w:p>
+    <w:p>
+      <w:pPr>
+        <w:pStyle w:val="ListBullet"/>
+        <w:spacing w:after="60" w:line="300" w:lineRule="auto"/>
+        <w:ind w:left="369" w:hanging="142"/>
+      </w:pPr>
+      <w:r>
+        <w:rPr>
+          <w:rFonts w:ascii="Aptos" w:hAnsi="Aptos" w:eastAsia="Microsoft YaHei"/>
+          <w:b w:val="0"/>
+          <w:color w:val="303030"/>
+          <w:sz w:val="20"/>
+        </w:rPr>
+        <w:t>线上抽查 400 篇正文：0 篇再出现标签或样式泄漏；该文现在解析为 6 段干净正文，页面 data 约 10 KB。</w:t>
+      </w:r>
+    </w:p>
+    <w:p>
+      <w:pPr>
         <w:pStyle w:val="Heading1"/>
         <w:keepNext/>
         <w:spacing w:before="280" w:after="140" w:line="264" w:lineRule="auto"/>
@@ -4476,6 +4648,117 @@
                 <w:color w:val="303030"/>
                 <w:sz w:val="18"/>
               </w:rPr>
+              <w:t>正文标签处理</w:t>
+            </w:r>
+          </w:p>
+        </w:tc>
+        <w:tc>
+          <w:tcPr>
+            <w:tcW w:type="dxa" w:w="3969"/>
+            <w:vAlign w:val="center"/>
+            <w:tcBorders>
+              <w:top w:val="single" w:sz="6" w:color="D9D9D9"/>
+              <w:left w:val="single" w:sz="6" w:color="D9D9D9"/>
+              <w:bottom w:val="single" w:sz="6" w:color="D9D9D9"/>
+              <w:right w:val="single" w:sz="6" w:color="D9D9D9"/>
+              <w:insideH w:val="single" w:sz="6" w:color="D9D9D9"/>
+              <w:insideV w:val="single" w:sz="6" w:color="D9D9D9"/>
+            </w:tcBorders>
+            <w:tcMar>
+              <w:top w:w="100" w:type="dxa"/>
+              <w:start w:w="120" w:type="dxa"/>
+              <w:bottom w:w="100" w:type="dxa"/>
+              <w:end w:w="120" w:type="dxa"/>
+            </w:tcMar>
+          </w:tcPr>
+          <w:p>
+            <w:pPr>
+              <w:spacing w:after="0" w:line="288" w:lineRule="auto"/>
+              <w:jc w:val="left"/>
+            </w:pPr>
+            <w:r>
+              <w:rPr>
+                <w:rFonts w:ascii="Aptos" w:hAnsi="Aptos" w:eastAsia="Microsoft YaHei"/>
+                <w:b w:val="0"/>
+                <w:color w:val="303030"/>
+                <w:sz w:val="18"/>
+              </w:rPr>
+              <w:t>services/article-body.js</w:t>
+            </w:r>
+          </w:p>
+        </w:tc>
+        <w:tc>
+          <w:tcPr>
+            <w:tcW w:type="dxa" w:w="3288"/>
+            <w:vAlign w:val="center"/>
+            <w:tcBorders>
+              <w:top w:val="single" w:sz="6" w:color="D9D9D9"/>
+              <w:left w:val="single" w:sz="6" w:color="D9D9D9"/>
+              <w:bottom w:val="single" w:sz="6" w:color="D9D9D9"/>
+              <w:right w:val="single" w:sz="6" w:color="D9D9D9"/>
+              <w:insideH w:val="single" w:sz="6" w:color="D9D9D9"/>
+              <w:insideV w:val="single" w:sz="6" w:color="D9D9D9"/>
+            </w:tcBorders>
+            <w:tcMar>
+              <w:top w:w="100" w:type="dxa"/>
+              <w:start w:w="120" w:type="dxa"/>
+              <w:bottom w:w="100" w:type="dxa"/>
+              <w:end w:w="120" w:type="dxa"/>
+            </w:tcMar>
+          </w:tcPr>
+          <w:p>
+            <w:pPr>
+              <w:spacing w:after="0" w:line="288" w:lineRule="auto"/>
+              <w:jc w:val="left"/>
+            </w:pPr>
+            <w:r>
+              <w:rPr>
+                <w:rFonts w:ascii="Aptos" w:hAnsi="Aptos" w:eastAsia="Microsoft YaHei"/>
+                <w:b w:val="0"/>
+                <w:color w:val="303030"/>
+                <w:sz w:val="18"/>
+              </w:rPr>
+              <w:t>忽略不认识的包装标签，Word 粘贴的正文不再显示源码</w:t>
+            </w:r>
+          </w:p>
+        </w:tc>
+      </w:tr>
+      <w:tr>
+        <w:trPr>
+          <w:cantSplit/>
+        </w:trPr>
+        <w:tc>
+          <w:tcPr>
+            <w:tcW w:type="dxa" w:w="1474"/>
+            <w:vAlign w:val="center"/>
+            <w:tcBorders>
+              <w:top w:val="single" w:sz="6" w:color="D9D9D9"/>
+              <w:left w:val="single" w:sz="6" w:color="D9D9D9"/>
+              <w:bottom w:val="single" w:sz="6" w:color="D9D9D9"/>
+              <w:right w:val="single" w:sz="6" w:color="D9D9D9"/>
+              <w:insideH w:val="single" w:sz="6" w:color="D9D9D9"/>
+              <w:insideV w:val="single" w:sz="6" w:color="D9D9D9"/>
+            </w:tcBorders>
+            <w:tcMar>
+              <w:top w:w="100" w:type="dxa"/>
+              <w:start w:w="120" w:type="dxa"/>
+              <w:bottom w:w="100" w:type="dxa"/>
+              <w:end w:w="120" w:type="dxa"/>
+            </w:tcMar>
+            <w:shd w:fill="EDF6FA"/>
+          </w:tcPr>
+          <w:p>
+            <w:pPr>
+              <w:spacing w:after="0" w:line="288" w:lineRule="auto"/>
+              <w:jc w:val="left"/>
+            </w:pPr>
+            <w:r>
+              <w:rPr>
+                <w:rFonts w:ascii="Aptos" w:hAnsi="Aptos" w:eastAsia="Microsoft YaHei"/>
+                <w:b w:val="0"/>
+                <w:color w:val="303030"/>
+                <w:sz w:val="18"/>
+              </w:rPr>
               <w:t>web-view 兜底页</w:t>
             </w:r>
           </w:p>
@@ -4498,6 +4781,7 @@
               <w:bottom w:w="100" w:type="dxa"/>
               <w:end w:w="120" w:type="dxa"/>
             </w:tcMar>
+            <w:shd w:fill="EDF6FA"/>
           </w:tcPr>
           <w:p>
             <w:pPr>
@@ -4537,6 +4821,7 @@
               <w:bottom w:w="100" w:type="dxa"/>
               <w:end w:w="120" w:type="dxa"/>
             </w:tcMar>
+            <w:shd w:fill="EDF6FA"/>
           </w:tcPr>
           <w:p>
             <w:pPr>
@@ -4577,7 +4862,6 @@
               <w:bottom w:w="100" w:type="dxa"/>
               <w:end w:w="120" w:type="dxa"/>
             </w:tcMar>
-            <w:shd w:fill="EDF6FA"/>
           </w:tcPr>
           <w:p>
             <w:pPr>
@@ -4613,7 +4897,6 @@
               <w:bottom w:w="100" w:type="dxa"/>
               <w:end w:w="120" w:type="dxa"/>
             </w:tcMar>
-            <w:shd w:fill="EDF6FA"/>
           </w:tcPr>
           <w:p>
             <w:pPr>
@@ -4655,7 +4938,6 @@
               <w:bottom w:w="100" w:type="dxa"/>
               <w:end w:w="120" w:type="dxa"/>
             </w:tcMar>
-            <w:shd w:fill="EDF6FA"/>
           </w:tcPr>
           <w:p>
             <w:pPr>
@@ -4696,6 +4978,7 @@
               <w:bottom w:w="100" w:type="dxa"/>
               <w:end w:w="120" w:type="dxa"/>
             </w:tcMar>
+            <w:shd w:fill="EDF6FA"/>
           </w:tcPr>
           <w:p>
             <w:pPr>
@@ -4731,6 +5014,7 @@
               <w:bottom w:w="100" w:type="dxa"/>
               <w:end w:w="120" w:type="dxa"/>
             </w:tcMar>
+            <w:shd w:fill="EDF6FA"/>
           </w:tcPr>
           <w:p>
             <w:pPr>
@@ -4768,6 +5052,7 @@
               <w:bottom w:w="100" w:type="dxa"/>
               <w:end w:w="120" w:type="dxa"/>
             </w:tcMar>
+            <w:shd w:fill="EDF6FA"/>
           </w:tcPr>
           <w:p>
             <w:pPr>
@@ -4808,7 +5093,6 @@
               <w:bottom w:w="100" w:type="dxa"/>
               <w:end w:w="120" w:type="dxa"/>
             </w:tcMar>
-            <w:shd w:fill="EDF6FA"/>
           </w:tcPr>
           <w:p>
             <w:pPr>
@@ -4844,7 +5128,6 @@
               <w:bottom w:w="100" w:type="dxa"/>
               <w:end w:w="120" w:type="dxa"/>
             </w:tcMar>
-            <w:shd w:fill="EDF6FA"/>
           </w:tcPr>
           <w:p>
             <w:pPr>
@@ -4884,7 +5167,6 @@
               <w:bottom w:w="100" w:type="dxa"/>
               <w:end w:w="120" w:type="dxa"/>
             </w:tcMar>
-            <w:shd w:fill="EDF6FA"/>
           </w:tcPr>
           <w:p>
             <w:pPr>
@@ -5643,7 +5925,7 @@
                 <w:color w:val="303030"/>
                 <w:sz w:val="18"/>
               </w:rPr>
-              <w:t>奖项卡片复用</w:t>
+              <w:t>正文标签处理</w:t>
             </w:r>
           </w:p>
         </w:tc>
@@ -5715,7 +5997,7 @@
                 <w:color w:val="303030"/>
                 <w:sz w:val="18"/>
               </w:rPr>
-              <w:t>抽查 86 篇线上奖项文章：82 篇卡片全部走统一模板、无原始卡片标记残留；示例文 15 张卡片解析完整，律所/城市/联系方式分行，profile 链接与图片路径归一化</w:t>
+              <w:t>线上抽查 400 篇正文：0 篇出现标签/样式泄漏；示例文解析为 6 段干净正文，页面 data 约 10 KB</w:t>
             </w:r>
           </w:p>
         </w:tc>
@@ -5755,7 +6037,7 @@
                 <w:color w:val="303030"/>
                 <w:sz w:val="18"/>
               </w:rPr>
-              <w:t>web-view 防循环</w:t>
+              <w:t>奖项卡片复用</w:t>
             </w:r>
           </w:p>
         </w:tc>
@@ -5825,7 +6107,7 @@
                 <w:color w:val="303030"/>
                 <w:sz w:val="18"/>
               </w:rPr>
-              <w:t>在 WebKit 中复现官网会员页的跳转链（/member_survey/1 → /member_survey/sign_in，相对地址导致路由回环）；单元验证 8 秒内 3 次重载触发兜底、分散加载不触发、Retry 清零</w:t>
+              <w:t>抽查 86 篇线上奖项文章：82 篇卡片全部走统一模板、无原始卡片标记残留；示例文 15 张卡片解析完整，律所/城市/联系方式分行，profile 链接与图片路径归一化</w:t>
             </w:r>
           </w:p>
         </w:tc>
@@ -5866,7 +6148,7 @@
                 <w:color w:val="303030"/>
                 <w:sz w:val="18"/>
               </w:rPr>
-              <w:t>加载中占位</w:t>
+              <w:t>web-view 防循环</w:t>
             </w:r>
           </w:p>
         </w:tc>
@@ -5938,7 +6220,7 @@
                 <w:color w:val="303030"/>
                 <w:sz w:val="18"/>
               </w:rPr>
-              <w:t>以 375×812 复刻确认加载期间仅显示页头与居中的 Loading...，页脚位于首屏之外；文章 / 交易详情页实测 loading→内容与 unavailable 两条分支</w:t>
+              <w:t>在 WebKit 中复现官网会员页的跳转链（/member_survey/1 → /member_survey/sign_in，相对地址导致路由回环）；单元验证 8 秒内 3 次重载触发兜底、分散加载不触发、Retry 清零</w:t>
             </w:r>
           </w:p>
         </w:tc>
@@ -5978,7 +6260,7 @@
                 <w:color w:val="303030"/>
                 <w:sz w:val="18"/>
               </w:rPr>
-              <w:t>页脚定位</w:t>
+              <w:t>加载中占位</w:t>
             </w:r>
           </w:p>
         </w:tc>
@@ -6048,7 +6330,7 @@
                 <w:color w:val="303030"/>
                 <w:sz w:val="18"/>
               </w:rPr>
-              <w:t>以 375×812 复刻空内容页确认页脚位于视口底部；并核对官网 /sign_in 同为页脚贴底（页面高度=视口高度）</w:t>
+              <w:t>以 375×812 复刻确认加载期间仅显示页头与居中的 Loading...，页脚位于首屏之外；文章 / 交易详情页实测 loading→内容与 unavailable 两条分支</w:t>
             </w:r>
           </w:p>
         </w:tc>
@@ -6089,7 +6371,7 @@
                 <w:color w:val="303030"/>
                 <w:sz w:val="18"/>
               </w:rPr>
-              <w:t>文章图片尺寸</w:t>
+              <w:t>页脚定位</w:t>
             </w:r>
           </w:p>
         </w:tc>
@@ -6161,7 +6443,7 @@
                 <w:color w:val="303030"/>
                 <w:sz w:val="18"/>
               </w:rPr>
-              <w:t>线上核对 Humanoid robotics 一文：500px 信息图改为整栏宽，291×36 分隔条保留原尺寸，旧 Blob 地址改写为 CDN</w:t>
+              <w:t>以 375×812 复刻空内容页确认页脚位于视口底部；并核对官网 /sign_in 同为页脚贴底（页面高度=视口高度）</w:t>
             </w:r>
           </w:p>
         </w:tc>
@@ -6201,7 +6483,7 @@
                 <w:color w:val="303030"/>
                 <w:sz w:val="18"/>
               </w:rPr>
-              <w:t>律所 Head office</w:t>
+              <w:t>文章图片尺寸</w:t>
             </w:r>
           </w:p>
         </w:tc>
@@ -6271,7 +6553,7 @@
                 <w:color w:val="303030"/>
                 <w:sz w:val="18"/>
               </w:rPr>
-              <w:t>线上核对 Grandway：headOffice 输出 Beijing, China 且办公室 id 与官网链接一致；抽查 100 家律所，仅 1 家有计数但无 headOffice 标记，小程序与官网一样不显示该行</w:t>
+              <w:t>线上核对 Humanoid robotics 一文：500px 信息图改为整栏宽，291×36 分隔条保留原尺寸，旧 Blob 地址改写为 CDN</w:t>
             </w:r>
           </w:p>
         </w:tc>
@@ -6312,7 +6594,7 @@
                 <w:color w:val="303030"/>
                 <w:sz w:val="18"/>
               </w:rPr>
-              <w:t>验证页字段</w:t>
+              <w:t>律所 Head office</w:t>
             </w:r>
           </w:p>
         </w:tc>
@@ -6384,7 +6666,7 @@
                 <w:color w:val="303030"/>
                 <w:sz w:val="18"/>
               </w:rPr>
-              <w:t>以截图中的 v-1788488697394 运行页面逻辑，Law firm 输出 Guantao Law Firm</w:t>
+              <w:t>线上核对 Grandway：headOffice 输出 Beijing, China 且办公室 id 与官网链接一致；抽查 100 家律所，仅 1 家有计数但无 headOffice 标记，小程序与官网一样不显示该行</w:t>
             </w:r>
           </w:p>
         </w:tc>
@@ -6424,7 +6706,7 @@
                 <w:color w:val="303030"/>
                 <w:sz w:val="18"/>
               </w:rPr>
-              <w:t>验证页版式</w:t>
+              <w:t>验证页字段</w:t>
             </w:r>
           </w:p>
         </w:tc>
@@ -6494,7 +6776,7 @@
                 <w:color w:val="303030"/>
                 <w:sz w:val="18"/>
               </w:rPr>
-              <w:t>在 WebKit 中以 375 / 390px 渲染官网验证页读取计算样式，再用同一套数值复刻小程序页面并排比对，徽标位置、灰卡与渐变面板一致</w:t>
+              <w:t>以截图中的 v-1788488697394 运行页面逻辑，Law firm 输出 Guantao Law Firm</w:t>
             </w:r>
           </w:p>
         </w:tc>
@@ -6535,7 +6817,7 @@
                 <w:color w:val="303030"/>
                 <w:sz w:val="18"/>
               </w:rPr>
-              <w:t>提交入口</w:t>
+              <w:t>验证页版式</w:t>
             </w:r>
           </w:p>
         </w:tc>
@@ -6607,7 +6889,7 @@
                 <w:color w:val="303030"/>
                 <w:sz w:val="18"/>
               </w:rPr>
-              <w:t>两处按钮均生成 /pages/webview/webview?url=https%3A%2F%2Fwww.legaloneglobal.com%2Fforms%2Fdeal-submission</w:t>
+              <w:t>在 WebKit 中以 375 / 390px 渲染官网验证页读取计算样式，再用同一套数值复刻小程序页面并排比对，徽标位置、灰卡与渐变面板一致</w:t>
             </w:r>
           </w:p>
         </w:tc>
@@ -6647,7 +6929,7 @@
                 <w:color w:val="303030"/>
                 <w:sz w:val="18"/>
               </w:rPr>
-              <w:t>模板与样式</w:t>
+              <w:t>提交入口</w:t>
             </w:r>
           </w:p>
         </w:tc>
@@ -6717,7 +6999,7 @@
                 <w:color w:val="303030"/>
                 <w:sz w:val="18"/>
               </w:rPr>
-              <w:t>涉及的 WXML 标签配对、WXSS 花括号配对检查通过，无悬空样式类</w:t>
+              <w:t>两处按钮均生成 /pages/webview/webview?url=https%3A%2F%2Fwww.legaloneglobal.com%2Fforms%2Fdeal-submission</w:t>
             </w:r>
           </w:p>
         </w:tc>
@@ -6758,7 +7040,7 @@
                 <w:color w:val="303030"/>
                 <w:sz w:val="18"/>
               </w:rPr>
-              <w:t>微信真机预览</w:t>
+              <w:t>模板与样式</w:t>
             </w:r>
           </w:p>
         </w:tc>
@@ -6794,6 +7076,117 @@
                 <w:color w:val="303030"/>
                 <w:sz w:val="18"/>
               </w:rPr>
+              <w:t>通过</w:t>
+            </w:r>
+          </w:p>
+        </w:tc>
+        <w:tc>
+          <w:tcPr>
+            <w:tcW w:type="dxa" w:w="5783"/>
+            <w:vAlign w:val="center"/>
+            <w:tcBorders>
+              <w:top w:val="single" w:sz="6" w:color="D9D9D9"/>
+              <w:left w:val="single" w:sz="6" w:color="D9D9D9"/>
+              <w:bottom w:val="single" w:sz="6" w:color="D9D9D9"/>
+              <w:right w:val="single" w:sz="6" w:color="D9D9D9"/>
+              <w:insideH w:val="single" w:sz="6" w:color="D9D9D9"/>
+              <w:insideV w:val="single" w:sz="6" w:color="D9D9D9"/>
+            </w:tcBorders>
+            <w:tcMar>
+              <w:top w:w="100" w:type="dxa"/>
+              <w:start w:w="120" w:type="dxa"/>
+              <w:bottom w:w="100" w:type="dxa"/>
+              <w:end w:w="120" w:type="dxa"/>
+            </w:tcMar>
+            <w:shd w:fill="EDF6FA"/>
+          </w:tcPr>
+          <w:p>
+            <w:pPr>
+              <w:spacing w:after="0" w:line="288" w:lineRule="auto"/>
+              <w:jc w:val="left"/>
+            </w:pPr>
+            <w:r>
+              <w:rPr>
+                <w:rFonts w:ascii="Aptos" w:hAnsi="Aptos" w:eastAsia="Microsoft YaHei"/>
+                <w:b w:val="0"/>
+                <w:color w:val="303030"/>
+                <w:sz w:val="18"/>
+              </w:rPr>
+              <w:t>涉及的 WXML 标签配对、WXSS 花括号配对检查通过，无悬空样式类</w:t>
+            </w:r>
+          </w:p>
+        </w:tc>
+      </w:tr>
+      <w:tr>
+        <w:trPr>
+          <w:cantSplit/>
+        </w:trPr>
+        <w:tc>
+          <w:tcPr>
+            <w:tcW w:type="dxa" w:w="1701"/>
+            <w:vAlign w:val="center"/>
+            <w:tcBorders>
+              <w:top w:val="single" w:sz="6" w:color="D9D9D9"/>
+              <w:left w:val="single" w:sz="6" w:color="D9D9D9"/>
+              <w:bottom w:val="single" w:sz="6" w:color="D9D9D9"/>
+              <w:right w:val="single" w:sz="6" w:color="D9D9D9"/>
+              <w:insideH w:val="single" w:sz="6" w:color="D9D9D9"/>
+              <w:insideV w:val="single" w:sz="6" w:color="D9D9D9"/>
+            </w:tcBorders>
+            <w:tcMar>
+              <w:top w:w="100" w:type="dxa"/>
+              <w:start w:w="120" w:type="dxa"/>
+              <w:bottom w:w="100" w:type="dxa"/>
+              <w:end w:w="120" w:type="dxa"/>
+            </w:tcMar>
+          </w:tcPr>
+          <w:p>
+            <w:pPr>
+              <w:spacing w:after="0" w:line="288" w:lineRule="auto"/>
+              <w:jc w:val="left"/>
+            </w:pPr>
+            <w:r>
+              <w:rPr>
+                <w:rFonts w:ascii="Aptos" w:hAnsi="Aptos" w:eastAsia="Microsoft YaHei"/>
+                <w:b w:val="0"/>
+                <w:color w:val="303030"/>
+                <w:sz w:val="18"/>
+              </w:rPr>
+              <w:t>微信真机预览</w:t>
+            </w:r>
+          </w:p>
+        </w:tc>
+        <w:tc>
+          <w:tcPr>
+            <w:tcW w:type="dxa" w:w="1247"/>
+            <w:vAlign w:val="center"/>
+            <w:tcBorders>
+              <w:top w:val="single" w:sz="6" w:color="D9D9D9"/>
+              <w:left w:val="single" w:sz="6" w:color="D9D9D9"/>
+              <w:bottom w:val="single" w:sz="6" w:color="D9D9D9"/>
+              <w:right w:val="single" w:sz="6" w:color="D9D9D9"/>
+              <w:insideH w:val="single" w:sz="6" w:color="D9D9D9"/>
+              <w:insideV w:val="single" w:sz="6" w:color="D9D9D9"/>
+            </w:tcBorders>
+            <w:tcMar>
+              <w:top w:w="100" w:type="dxa"/>
+              <w:start w:w="120" w:type="dxa"/>
+              <w:bottom w:w="100" w:type="dxa"/>
+              <w:end w:w="120" w:type="dxa"/>
+            </w:tcMar>
+          </w:tcPr>
+          <w:p>
+            <w:pPr>
+              <w:spacing w:after="0" w:line="288" w:lineRule="auto"/>
+              <w:jc w:val="left"/>
+            </w:pPr>
+            <w:r>
+              <w:rPr>
+                <w:rFonts w:ascii="Aptos" w:hAnsi="Aptos" w:eastAsia="Microsoft YaHei"/>
+                <w:b w:val="0"/>
+                <w:color w:val="303030"/>
+                <w:sz w:val="18"/>
+              </w:rPr>
               <w:t>待完成</w:t>
             </w:r>
           </w:p>
@@ -6816,7 +7209,6 @@
               <w:bottom w:w="100" w:type="dxa"/>
               <w:end w:w="120" w:type="dxa"/>
             </w:tcMar>
-            <w:shd w:fill="EDF6FA"/>
           </w:tcPr>
           <w:p>
             <w:pPr>
@@ -6951,6 +7343,22 @@
           <w:sz w:val="20"/>
         </w:rPr>
         <w:t>验证页：抽查若干条验证记录，确认 verified 徽标位于白色页面上（不在灰色证书卡内）、灰色证书卡与蓝色渐变面板的底色和间距与官网一致，Law firm 一行显示正常。</w:t>
+      </w:r>
+    </w:p>
+    <w:p>
+      <w:pPr>
+        <w:pStyle w:val="ListBullet"/>
+        <w:spacing w:after="60" w:line="300" w:lineRule="auto"/>
+        <w:ind w:left="369" w:hanging="142"/>
+      </w:pPr>
+      <w:r>
+        <w:rPr>
+          <w:rFonts w:ascii="Aptos" w:hAnsi="Aptos" w:eastAsia="Microsoft YaHei"/>
+          <w:b w:val="0"/>
+          <w:color w:val="303030"/>
+          <w:sz w:val="20"/>
+        </w:rPr>
+        <w:t>文章详情：打开 Sullivan &amp; Cromwell 这类正文，确认只显示正常段落，不再出现 div / style 等源码。</w:t>
       </w:r>
     </w:p>
     <w:p>

</xml_diff>